<commit_message>
docs(paper): tighten punctuation and clause structure in the prose
The prose leaned hard on one construction. Em-dashes ran at 57 across 4,510
words, roughly one every 79 words, several times the rate the rest of the
writing warranted and enough that the paper had a recognisable tic.

Reduced to one. Paired parenthetical asides became parentheses or comma
clauses, single connectors became colons, semicolons or full stops, and the
"term - definition" bullets became plain sentences. Read back afterwards; the
replacements are natural and several passages read better for losing the dash.

Sentence-length variance was already healthy and is unchanged (mean 20.7,
stdev 11.3, 15% under ten words and 12% over thirty-five). No claim, number or
citation is touched here - this is punctuation and clause structure only, and
the artifact-generated numbers are untouched by construction.
</commit_message>
<xml_diff>
--- a/docs/paper/OrbitGuard_paper_draft.docx
+++ b/docs/paper/OrbitGuard_paper_draft.docx
@@ -70,7 +70,7 @@
         <w:rPr>
           <w:sz w:val="18"/>
         </w:rPr>
-        <w:t>Fitting one feature scaler across several groups of data is an ordinary thing to do. We show it can quietly destroy a sequence model while every check a practitioner would normally run says the pipeline is fine. On 70,000 simulated interplanetary trajectories across seven targets, a Transformer trained under a scaler pooled across a group of targets stops responding to its input on Venus: the standard deviation of its held-out prediction is 3.11e-05 and its validation AUC is 0.6037, against 0.9999 for the same architecture under per-timestep normalisation. Every one of the 1,500 held-out missions falls inside a window 3.2e-04 wide. A gradient-boosted tree fitted to the very same arrays does not notice: its AUC moves by at most 0.0002 across all three normalisation settings, and it reports the task as almost perfectly separable while the network cannot separate it at all. So the usual instinct — check a simple baseline before blaming the data — fails exactly here, because trees are invariant to the thing that breaks the network. The effect is severe but not universal: 1 of 4 targets collapses outright and the rest lose between 0.0003 and 0.0925 AUC while still working, so we report when it happens and when it does not. We separate the two kinds of pooling that are usually confused — pooling across timesteps is survivable, pooling across groups is not — give a diagnostic based on the spread of the predictions rather than on accuracy, and report a second failure of the same model, which cannot reach a rare class that a tree recovers from the identical input. Across 5 seeds the compression is identical and the collapse recurs on 4 of them, so it is a property of the preprocessing rather than of one unlucky initialisation.</w:t>
+        <w:t>Fitting one feature scaler across several groups of data is an ordinary thing to do. We show it can quietly destroy a sequence model while every check a practitioner would normally run says the pipeline is fine. On 70,000 simulated interplanetary trajectories across seven targets, a Transformer trained under a scaler pooled across a group of targets stops responding to its input on Venus: the standard deviation of its held-out prediction is 3.11e-05 and its validation AUC is 0.6037, against 0.9999 for the same architecture under per-timestep normalisation. Every one of the 1,500 held-out missions falls inside a window 3.2e-04 wide. A gradient-boosted tree fitted to the very same arrays does not notice: its AUC moves by at most 0.0002 across all three normalisation settings, and it reports the task as almost perfectly separable while the network cannot separate it at all. So the usual instinct (check a simple baseline before blaming the data) fails exactly here, because trees are invariant to the thing that breaks the network. The effect is severe but not universal: 1 of 4 targets collapses outright and the rest lose between 0.0003 and 0.0925 AUC while still working, so we report when it happens and when it does not. We separate the two kinds of pooling that are usually confused (pooling across timesteps is survivable, pooling across groups is not), give a diagnostic based on the spread of the predictions rather than on accuracy, and report a second failure of the same model, which cannot reach a rare class that a tree recovers from the identical input. Across 5 seeds the compression is identical and the collapse recurs on 4 of them, so it is a property of the preprocessing rather than of one unlucky initialisation.</w:t>
       </w:r>
     </w:p>
     <w:p>
@@ -111,7 +111,7 @@
         <w:rPr>
           <w:sz w:val="19"/>
         </w:rPr>
-        <w:t xml:space="preserve">Monte Carlo trajectory campaigns spend most of their compute on runs that were already doomed when the spacecraft left its parking orbit. Flight projects run these campaigns as a matter of course — TESS, for one, used a large dispersion campaign to drive its trajectory design </w:t>
+        <w:t xml:space="preserve">Monte Carlo trajectory campaigns spend most of their compute on runs that were already doomed when the spacecraft left its parking orbit. Flight projects run these campaigns as a matter of course; TESS, for one, used a large dispersion campaign to drive its trajectory design </w:t>
       </w:r>
       <w:r>
         <w:rPr>
@@ -123,7 +123,7 @@
         <w:rPr>
           <w:sz w:val="19"/>
         </w:rPr>
-        <w:t xml:space="preserve"> — and the cost is real enough that a body of work exists purely to make each propagation cheaper </w:t>
+        <w:t xml:space="preserve">. The cost is real enough that a body of work exists purely to make each propagation cheaper </w:t>
       </w:r>
       <w:r>
         <w:rPr>
@@ -171,7 +171,7 @@
         <w:rPr>
           <w:sz w:val="19"/>
         </w:rPr>
-        <w:t>. The problem is that the property that makes them a good check in general — invariance to how the features are scaled — is precisely what makes them blind to this particular defect. The check cannot fail the model, so it certifies it.</w:t>
+        <w:t>. The problem is that the property that makes them a good check in general (invariance to how the features are scaled) is precisely what makes them blind to this particular defect. The check cannot fail the model, so it certifies it.</w:t>
       </w:r>
     </w:p>
     <w:p>
@@ -179,7 +179,7 @@
         <w:rPr>
           <w:sz w:val="19"/>
         </w:rPr>
-        <w:t>We make three contributions. First, a controlled decomposition of the collapse that separates pooling across timesteps from pooling across groups, and shows only the second is fatal. Second, a demonstration that a scale-invariant baseline actively signs off on the broken configuration, together with a cheap diagnostic that does catch it. Third, a second failure of the same model — it cannot reach a rare class that is recoverable from its own input — which we measure rather than assume. We also report, because it bounds how much the first two matter in practice, that the application which motivated all of this does not need a sequence model at all.</w:t>
+        <w:t>We make three contributions. First, a controlled decomposition of the collapse that separates pooling across timesteps from pooling across groups, and shows only the second is fatal. Second, a demonstration that a scale-invariant baseline actively signs off on the broken configuration, together with a cheap diagnostic that does catch it. Third, a second failure of the same model: it cannot reach a rare class that is recoverable from its own input, which we measure rather than assume. We also report, because it bounds how much the first two matter in practice, that the application which motivated all of this does not need a sequence model at all.</w:t>
       </w:r>
     </w:p>
     <w:p>
@@ -221,7 +221,7 @@
         <w:rPr>
           <w:sz w:val="19"/>
         </w:rPr>
-        <w:t xml:space="preserve">Normalisation is central to training deep networks, and the standard layers — batch, layer, group and instance normalisation — all address some version of the problem </w:t>
+        <w:t xml:space="preserve">Normalisation is central to training deep networks, and the standard layers (batch, layer, group and instance normalisation) all address some version of the problem </w:t>
       </w:r>
       <w:r>
         <w:rPr>
@@ -290,7 +290,7 @@
         <w:rPr>
           <w:sz w:val="19"/>
         </w:rPr>
-        <w:t>. Grouped data with heterogeneous scales offers an unusually clean shortcut: the gap between group centroids. A model that learns only that gap can post a validation AUC above 0.95 while being useless inside every individual group, which is exactly what we observed. Our contribution here is a diagnostic — the spread of the predictions within a group — that separates this case from ordinary underfitting and needs no labels.</w:t>
+        <w:t>. Grouped data with heterogeneous scales offers an unusually clean shortcut: the gap between group centroids. A model that learns only that gap can post a validation AUC above 0.95 while being useless inside every individual group, which is exactly what we observed. Our contribution here is a diagnostic (the spread of the predictions within a group) that separates this case from ordinary underfitting and needs no labels.</w:t>
       </w:r>
     </w:p>
     <w:p>
@@ -368,7 +368,7 @@
         <w:rPr>
           <w:sz w:val="19"/>
         </w:rPr>
-        <w:t xml:space="preserve"> we report a case where none of that is the issue: oversampling a rare failure mode by a factor of 19.2 moves its recall not at all, while a tree on the same window separates it almost perfectly. The evidence in the space domain runs the same way — the ESA anomaly benchmark reports that current sequence models still struggle on rare but operationally important events in real satellite telemetry </w:t>
+        <w:t xml:space="preserve"> we report a case where none of that is the issue: oversampling a rare failure mode by a factor of 19.2 moves its recall not at all, while a tree on the same window separates it almost perfectly. The evidence in the space domain runs the same way. The ESA anomaly benchmark reports that current sequence models still struggle on rare but operationally important events in real satellite telemetry </w:t>
       </w:r>
       <w:r>
         <w:rPr>
@@ -461,7 +461,7 @@
         <w:rPr>
           <w:sz w:val="19"/>
         </w:rPr>
-        <w:t xml:space="preserve">. Screening specifically — using a learned model to decide which of a very large number of candidate cases deserve full analysis — is established in conjunction assessment, both as an ESA competition on real conjunction data </w:t>
+        <w:t xml:space="preserve">. Screening specifically, using a learned model to decide which of a very large number of candidate cases deserve full analysis, is established in conjunction assessment, both as an ESA competition on real conjunction data </w:t>
       </w:r>
       <w:r>
         <w:rPr>
@@ -555,7 +555,7 @@
         <w:rPr>
           <w:sz w:val="19"/>
         </w:rPr>
-        <w:t xml:space="preserve">The corpus is 70,000 simulated Earth-departure missions across seven interplanetary targets — Mercury, Venus, Mars, Jupiter, Saturn, Uranus and Neptune — with 10,000 missions each, generated with a deterministic two/three-body propagator in NASA's General Mission Analysis Tool, which is itself an extensively verified piece of software </w:t>
+        <w:t xml:space="preserve">The corpus is 70,000 simulated Earth-departure missions across seven interplanetary targets (Mercury, Venus, Mars, Jupiter, Saturn, Uranus and Neptune), with 10,000 missions each, generated with a deterministic two/three-body propagator in NASA's General Mission Analysis Tool, which is itself an extensively verified piece of software </w:t>
       </w:r>
       <w:r>
         <w:rPr>
@@ -567,7 +567,7 @@
         <w:rPr>
           <w:sz w:val="19"/>
         </w:rPr>
-        <w:t>. Each mission is described by six injection offsets: three components of the trans-orbit-insertion burn (dv_V, dv_N, dv_B) and three parking-orbit angles (RAAN, AOP, INC). Each is labelled success or failure, and failures are further typed by physical mode — surface impact, orbit too high, missed target, and a few others.</w:t>
+        <w:t>. Each mission is described by six injection offsets: three components of the trans-orbit-insertion burn (dv_V, dv_N, dv_B) and three parking-orbit angles (RAAN, AOP, INC). Each is labelled success or failure, and failures are further typed by physical mode: surface impact, orbit too high, missed target, and a few others.</w:t>
       </w:r>
     </w:p>
     <w:p>
@@ -616,7 +616,7 @@
         <w:rPr>
           <w:sz w:val="19"/>
         </w:rPr>
-        <w:t>The sequence model is a Pre-LN Transformer encoder with d_model 128, 8 attention heads, 4 layers and CLS-token pooling, carrying two heads on a shared trunk: one for the mission outcome and one for the failure mode. It is trained on random-length prefixes, so its predictions are in-distribution at any point in the stream rather than only at the 40% mark. The baseline is XGBoost with 300 trees at depth 5, fitted to the same normalised prefix, flattened. Throughout this paper, 'the same input' means literally the same array — the baseline consumes the view the network is given, not a re-derived feature set. That detail carries most of the argument, so we are strict about it.</w:t>
+        <w:t>The sequence model is a Pre-LN Transformer encoder with d_model 128, 8 attention heads, 4 layers and CLS-token pooling, carrying two heads on a shared trunk: one for the mission outcome and one for the failure mode. It is trained on random-length prefixes, so its predictions are in-distribution at any point in the stream rather than only at the 40% mark. The baseline is XGBoost with 300 trees at depth 5, fitted to the same normalised prefix, flattened. Throughout this paper, 'the same input' means literally the same array: the baseline consumes the view the network is given, not a re-derived feature set. That detail carries most of the argument, so we are strict about it.</w:t>
       </w:r>
     </w:p>
     <w:p>
@@ -650,7 +650,7 @@
         <w:rPr>
           <w:sz w:val="18"/>
         </w:rPr>
-        <w:t>per-timestep — each feature is standardised against its distribution at that timestep index, across the missions of one target. This is the configuration the working system uses.</w:t>
+        <w:t>per-timestep: each feature is standardised against its distribution at that timestep index, across the missions of one target. This is the configuration the working system uses.</w:t>
       </w:r>
     </w:p>
     <w:p>
@@ -663,7 +663,7 @@
         <w:rPr>
           <w:sz w:val="18"/>
         </w:rPr>
-        <w:t>global — one RobustScaler (median and IQR) per target, pooled across all of that target's timesteps.</w:t>
+        <w:t>global: one RobustScaler (median and IQR) per target, pooled across all of that target's timesteps.</w:t>
       </w:r>
     </w:p>
     <w:p>
@@ -676,7 +676,7 @@
         <w:rPr>
           <w:sz w:val="18"/>
         </w:rPr>
-        <w:t>grouped — one RobustScaler pooled across every timestep of every target in a regime group (inner: Mercury, Venus, Mars; outer: Jupiter, Saturn, Uranus, Neptune). This is the setting that failed in production.</w:t>
+        <w:t>grouped: one RobustScaler pooled across every timestep of every target in a regime group (inner: Mercury, Venus, Mars; outer: Jupiter, Saturn, Uranus, Neptune). This is the setting that failed in production.</w:t>
       </w:r>
     </w:p>
     <w:p>
@@ -807,7 +807,7 @@
         <w:rPr>
           <w:sz w:val="19"/>
         </w:rPr>
-        <w:t>We measure this as the signal ratio: the mean across-mission standard deviation of the normalised features, computed inside the observed window only. The restriction matters more than it might seem. Averaged over the whole flight the metric is useless, because late timesteps carry enormous across-mission spread — failing trajectories have physically diverged by then — and that swamps the early signal, making every condition look healthy. The model commits at 40%, so the quantity that matters is the spread inside the prefix it actually sees.</w:t>
+        <w:t>We measure this as the signal ratio: the mean across-mission standard deviation of the normalised features, computed inside the observed window only. The restriction matters more than it might seem. Averaged over the whole flight the metric is useless, because late timesteps carry enormous across-mission spread, because failing trajectories have physically diverged by then, and that swamps the early signal, making every condition look healthy. The model commits at 40%, so the quantity that matters is the spread inside the prefix it actually sees.</w:t>
       </w:r>
     </w:p>
     <w:p>
@@ -851,7 +851,7 @@
         <w:rPr>
           <w:sz w:val="16"/>
         </w:rPr>
-        <w:t>Normalisation ablation. Identical architecture, seed and split; only the pooling differs. 'sig' is the mean within-timestep standard deviation of the normalised features in the observed window. 'std' is the standard deviation of P(fail) over the held-out split — the quantity that identifies a collapse, as against a model that is merely inaccurate.</w:t>
+        <w:t>Normalisation ablation. Identical architecture, seed and split; only the pooling differs. 'sig' is the mean within-timestep standard deviation of the normalised features in the observed window. 'std' is the standard deviation of P(fail) over the held-out split, the quantity that identifies a collapse, as against a model that is merely inaccurate.</w:t>
       </w:r>
     </w:p>
     <w:tbl>
@@ -1900,7 +1900,7 @@
         <w:rPr>
           <w:sz w:val="19"/>
         </w:rPr>
-        <w:t xml:space="preserve"> is the reason we use the word 'collapse' rather than 'underfitting'. A low AUC on its own is ambiguous — it is what you would see from a model that has learned something weak or wrong. A held-out prediction distribution three ten-thousandths wide is not ambiguous. The network has stopped being a function of its input.</w:t>
+        <w:t xml:space="preserve"> is the reason we use the word 'collapse' rather than 'underfitting'. A low AUC on its own is ambiguous: it is what you would see from a model that has learned something weak or wrong. A held-out prediction distribution three ten-thousandths wide is not ambiguous. The network has stopped being a function of its input.</w:t>
       </w:r>
     </w:p>
     <w:p>
@@ -1908,7 +1908,7 @@
         <w:rPr>
           <w:sz w:val="19"/>
         </w:rPr>
-        <w:t xml:space="preserve">The second result is that the collapse is selective, and we report this rather than only the case that breaks. On the other 3 targets the same manipulation costs between 0.0003 and 0.0925 AUC and leaves the output varying normally. Severity does not follow the signal ratio on its own either. Jupiter's signal is compressed to 0.0247, lower than Mercury's 0.0484, and yet Jupiter loses 0.0003 AUC where Mercury loses 0.0925 — because Jupiter's task is separable enough that even a badly attenuated signal is sufficient. Compression is necessary for the collapse but not sufficient; how hard the underlying task is modulates it. A rule of the form 'it collapses when the ratio drops below X' is therefore not supported by these data, and we do not claim one. </w:t>
+        <w:t xml:space="preserve">The second result is that the collapse is selective, and we report this rather than only the case that breaks. On the other 3 targets the same manipulation costs between 0.0003 and 0.0925 AUC and leaves the output varying normally. Severity does not follow the signal ratio on its own either. Jupiter's signal is compressed to 0.0247, lower than Mercury's 0.0484, and yet Jupiter loses 0.0003 AUC where Mercury loses 0.0925, because Jupiter's task is separable enough that even a badly attenuated signal is sufficient. Compression is necessary for the collapse but not sufficient; how hard the underlying task is modulates it. A rule of the form 'it collapses when the ratio drops below X' is therefore not supported by these data, and we do not claim one. </w:t>
       </w:r>
       <w:r>
         <w:rPr>
@@ -1987,7 +1987,7 @@
         <w:rPr>
           <w:sz w:val="19"/>
         </w:rPr>
-        <w:t>One note on scope. This ablation isolates normalisation and nothing else: a separate model is trained per target, and only the statistics are pooled. The production failure that prompted the study also shared a single model across the group, which compounds the problem, since one trunk then has to serve targets whose inputs have all been flattened toward a common constant. The numbers here are therefore a lower bound on the damage the full configuration does. They establish that pooled normalisation is sufficient on its own to destroy a target — not that this is a complete reconstruction of the original incident.</w:t>
+        <w:t>One note on scope. This ablation isolates normalisation and nothing else: a separate model is trained per target, and only the statistics are pooled. The production failure that prompted the study also shared a single model across the group, which compounds the problem, since one trunk then has to serve targets whose inputs have all been flattened toward a common constant. The numbers here are therefore a lower bound on the damage the full configuration does. They establish that pooled normalisation is sufficient on its own to destroy a target, not that this is a complete reconstruction of the original incident.</w:t>
       </w:r>
     </w:p>
     <w:p>
@@ -2508,7 +2508,7 @@
         <w:rPr>
           <w:sz w:val="19"/>
         </w:rPr>
-        <w:t>Under the grouped setting the tree reports AUC 1.0000 on Venus — the target where the network has collapsed to a constant at AUC 0.6037. Across all targets the tree's AUC moves by at most 0.0002 between settings, so for practical purposes it cannot see the choice at all. Someone who runs it to check whether the features carry signal — the standard move, and the correct instinct — gets an unambiguous yes, and reasonably concludes that the deep model needs tuning rather than that the pipeline is broken.</w:t>
+        <w:t>Under the grouped setting the tree reports AUC 1.0000 on Venus, the target where the network has collapsed to a constant at AUC 0.6037. Across all targets the tree's AUC moves by at most 0.0002 between settings, so for practical purposes it cannot see the choice at all. Someone who runs it to check whether the features carry signal, which is the standard move and the correct instinct, gets an unambiguous yes, and reasonably concludes that the deep model needs tuning rather than that the pipeline is broken.</w:t>
       </w:r>
     </w:p>
     <w:p>
@@ -2575,7 +2575,7 @@
         <w:rPr>
           <w:sz w:val="19"/>
         </w:rPr>
-        <w:t>This is the methodological point, and it is worth stating carefully, because the baseline is not wrong. The information really is present, and a tree really can use it. The baseline is uninformative about the question that was actually being asked, which is whether the network can use it. Invariance to feature scaling — normally an excellent reason to reach for a tree as a diagnostic — is exactly what makes it blind here. The check and the defect are orthogonal by construction, so no amount of care in running the check would have helped.</w:t>
+        <w:t>This is the methodological point, and it is worth stating carefully, because the baseline is not wrong. The information really is present, and a tree really can use it. The baseline is uninformative about the question that was actually being asked, which is whether the network can use it. Invariance to feature scaling, normally an excellent reason to reach for a tree as a diagnostic, is exactly what makes it blind here. The check and the defect are orthogonal by construction, so no amount of care in running the check would have helped.</w:t>
       </w:r>
     </w:p>
     <w:p>
@@ -2622,7 +2622,7 @@
         <w:rPr>
           <w:sz w:val="18"/>
         </w:rPr>
-        <w:t>Tree against network under identical preprocessing. A large gap in the tree's favour, with both fed the same array, says the network cannot exploit information that is present — rather than that the information is absent.</w:t>
+        <w:t>Tree against network under identical preprocessing. A large gap in the tree's favour, with both fed the same array, says the network cannot exploit information that is present, rather than that the information is absent.</w:t>
       </w:r>
     </w:p>
     <w:p>
@@ -3127,7 +3127,7 @@
         <w:rPr>
           <w:sz w:val="19"/>
         </w:rPr>
-        <w:t xml:space="preserve">The compression itself does not depend on the seed. Venus's signal ratio under grouped normalisation lands between 0.00222 and 0.00232 across all 5 runs — a spread of 5% against the 335x compression itself — because it is a property of the preprocessing and the data, not of the optimiser. The healthy condition is stable too: per-timestep AUC moves by at most 0.0004 between seeds. Mars, Mercury and Jupiter never collapse under any seed. </w:t>
+        <w:t xml:space="preserve">The compression itself does not depend on the seed. Venus's signal ratio under grouped normalisation lands between 0.00222 and 0.00232 across all 5 runs, a spread of 5% against the 335x compression itself, because it is a property of the preprocessing and the data, not of the optimiser. The healthy condition is stable too: per-timestep AUC moves by at most 0.0004 between seeds. Mars, Mercury and Jupiter never collapse under any seed. </w:t>
       </w:r>
     </w:p>
     <w:p>
@@ -3135,7 +3135,7 @@
         <w:rPr>
           <w:sz w:val="19"/>
         </w:rPr>
-        <w:t>What does depend on the seed is whether the network escapes. Venus collapses to a constant on 4 of 5 seeds, with held-out prediction spread between 1.57e-05 and 4.84e-05 — four orders of magnitude below the 4.66e-01 it reaches under correct normalisation. On the remaining seed it does not fully collapse, but it does not recover either: prediction spread 3.64e-02, still an order of magnitude short, at AUC 0.9305 against 0.9999 healthy. So the preprocessing reliably creates the conditions for the collapse, and the collapse is the usual but not the certain outcome.</w:t>
+        <w:t>What does depend on the seed is whether the network escapes. Venus collapses to a constant on 4 of 5 seeds, with held-out prediction spread between 1.57e-05 and 4.84e-05, four orders of magnitude below the 4.66e-01 it reaches under correct normalisation. On the remaining seed it does not fully collapse, but it does not recover either: prediction spread 3.64e-02, still an order of magnitude short, at AUC 0.9305 against 0.9999 healthy. So the preprocessing reliably creates the conditions for the collapse, and the collapse is the usual but not the certain outcome.</w:t>
       </w:r>
     </w:p>
     <w:p>
@@ -3143,7 +3143,7 @@
         <w:rPr>
           <w:sz w:val="19"/>
         </w:rPr>
-        <w:t>This is the practical argument for the prediction-spread diagnostic recommended above. Across these runs Venus's grouped AUC spans 0.5338 to 0.9305, a range that overlaps what a merely-degraded target scores — Mercury sits inside it on every seed while discriminating normally. AUC therefore cannot tell the two states apart. Prediction spread can: the collapsed runs and every healthy run are separated by orders of magnitude with nothing in between. If you are going to watch one number for this failure, watch that one.</w:t>
+        <w:t>This is the practical argument for the prediction-spread diagnostic recommended above. Across these runs Venus's grouped AUC spans 0.5338 to 0.9305, a range that overlaps what a merely-degraded target scores. Mercury sits inside it on every seed while discriminating normally. AUC therefore cannot tell the two states apart. Prediction spread can: the collapsed runs and every healthy run are separated by orders of magnitude with nothing in between. If you are going to watch one number for this failure, watch that one.</w:t>
       </w:r>
     </w:p>
     <w:p>
@@ -3151,7 +3151,7 @@
         <w:rPr>
           <w:sz w:val="19"/>
         </w:rPr>
-        <w:t>The baseline's blindness replicates more cleanly still. Across 5 seeds, 4 targets and three normalisation settings — 60 fitted trees in total — the tree's AUC never leaves the range 0.9989 to 1.0000, and within any one seed and target it moves by at most 0.0003 between settings. There is no seed on which the baseline notices. That matters more than the collapse count: the collapse is one target's misfortune, but a check that cannot fail is a property of the check.</w:t>
+        <w:t>The baseline's blindness replicates more cleanly still. Across 5 seeds, 4 targets and three normalisation settings, 60 fitted trees in total, the tree's AUC never leaves the range 0.9989 to 1.0000, and within any one seed and target it moves by at most 0.0003 between settings. There is no seed on which the baseline notices. That matters more than the collapse count: the collapse is one target's misfortune, but a check that cannot fail is a property of the check.</w:t>
       </w:r>
     </w:p>
     <w:p>
@@ -3655,7 +3655,7 @@
         <w:rPr>
           <w:sz w:val="19"/>
         </w:rPr>
-        <w:t>Two denominators are worth stating, because this number is easy to quote misleadingly. Relative to the majority failure mode the rare mode is oversampled by roughly 45x at the strongest setting. Relative to uniform sampling over the training set — which is what the sampler actually applies — the factor is 19.23x. We report the latter, because it describes what the optimiser saw.</w:t>
+        <w:t>Two denominators are worth stating, because this number is easy to quote misleadingly. Relative to the majority failure mode the rare mode is oversampled by roughly 45x at the strongest setting. Relative to uniform sampling over the training set, which is what the sampler actually applies, the factor is 19.23x. We report the latter, because it describes what the optimiser saw.</w:t>
       </w:r>
     </w:p>
     <w:p>
@@ -3663,7 +3663,7 @@
         <w:rPr>
           <w:sz w:val="19"/>
         </w:rPr>
-        <w:t>The sweep was repeated across 5 seeds, each of which redraws the split and therefore the rare mode itself. The gap replicates and the extremes do not: sequence recall on the rare mode ranges 0.0000 to 0.1429 across every seed and sampling weight, against a tree on the identical window at recall 0.9333 to 1.0000 and AUC 0.9997 to 1.0000. On every seed the sampling weight makes no difference whatsoever — recall is identical at all three settings within a seed, so the flat line in the figure is not a property of one run.</w:t>
+        <w:t>The sweep was repeated across 5 seeds, each of which redraws the split and therefore the rare mode itself. The gap replicates and the extremes do not: sequence recall on the rare mode ranges 0.0000 to 0.1429 across every seed and sampling weight, against a tree on the identical window at recall 0.9333 to 1.0000 and AUC 0.9997 to 1.0000. On every seed the sampling weight makes no difference whatsoever: recall is identical at all three settings within a seed, so the flat line in the figure is not a property of one run.</w:t>
       </w:r>
     </w:p>
     <w:p>
@@ -3812,7 +3812,7 @@
                 <w:b/>
                 <w:sz w:val="15"/>
               </w:rPr>
-              <w:t>T0 — six launch parameters, before propagating</w:t>
+              <w:t>T0: six launch parameters, before propagating</w:t>
             </w:r>
           </w:p>
         </w:tc>
@@ -3886,7 +3886,7 @@
                 <w:b w:val="0"/>
                 <w:sz w:val="15"/>
               </w:rPr>
-              <w:t>T40 — telemetry Transformer at 40%</w:t>
+              <w:t>T40: telemetry Transformer at 40%</w:t>
             </w:r>
           </w:p>
         </w:tc>
@@ -3960,7 +3960,7 @@
                 <w:b w:val="0"/>
                 <w:sz w:val="15"/>
               </w:rPr>
-              <w:t>Cascade — T0 where confident, else T40</w:t>
+              <w:t>Cascade: T0 where confident, else T40</w:t>
             </w:r>
           </w:p>
         </w:tc>
@@ -4130,7 +4130,7 @@
         <w:rPr>
           <w:sz w:val="19"/>
         </w:rPr>
-        <w:t xml:space="preserve">This is not an argument that the task is trivial. Logistic regression on the same six features scores between 0.4824 and 0.5410 AUC — chance — on every target, so the map from parameters to outcome is strongly nonlinear and does need a learned model. It just does not need a temporal one. A sequential screen earns its place only where the outcome is not settled at injection: mid-flight stochasticity, unmodelled dynamics, sensor noise, or campaigns where the launch parameters were never recorded. Reinforcement-learning trajectory work that certifies policies through dispersed Monte Carlo campaigns </w:t>
+        <w:t xml:space="preserve">This is not an argument that the task is trivial. Logistic regression on the same six features scores between 0.4824 and 0.5410 AUC (chance) on every target, so the map from parameters to outcome is strongly nonlinear and does need a learned model. It just does not need a temporal one. A sequential screen earns its place only where the outcome is not settled at injection: mid-flight stochasticity, unmodelled dynamics, sensor noise, or campaigns where the launch parameters were never recorded. Reinforcement-learning trajectory work that certifies policies through dispersed Monte Carlo campaigns </w:t>
       </w:r>
       <w:r>
         <w:rPr>
@@ -4158,7 +4158,7 @@
         <w:rPr>
           <w:sz w:val="19"/>
         </w:rPr>
-        <w:t>One methodological note on this table, since it cuts against the conclusion we draw. An earlier version was produced under two selection biases: thresholds were fitted on the test labels, and the evaluation set overlapped the sequence model's validation split. Both flattered T40 — the screen this section argues against. Removing them moved the headline by less than 0.1 percentage points, so the negative result survives its own correction, which is the strongest form the claim can take.</w:t>
+        <w:t>One methodological note on this table, since it cuts against the conclusion we draw. An earlier version was produced under two selection biases: thresholds were fitted on the test labels, and the evaluation set overlapped the sequence model's validation split. Both flattered T40, the screen this section argues against. Removing them moved the headline by less than 0.1 percentage points, so the negative result survives its own correction, which is the strongest form the claim can take.</w:t>
       </w:r>
     </w:p>
     <w:p>
@@ -4269,7 +4269,7 @@
         <w:rPr>
           <w:sz w:val="19"/>
         </w:rPr>
-        <w:t>Sharing a feature scaler across groups whose scales differ can reduce a deep model to a per-group constant, while a tree on the identical arrays reports the task as solved. None of the pieces are exotic. The preprocessing choice is one that a standard pipeline makes by default. The model is a plain Transformer. The baseline is the one most people would reach for. And the standard defence — check a simple baseline — is invariant to the defect by construction, so it cannot fail the broken model.</w:t>
+        <w:t>Sharing a feature scaler across groups whose scales differ can reduce a deep model to a per-group constant, while a tree on the identical arrays reports the task as solved. None of the pieces are exotic. The preprocessing choice is one that a standard pipeline makes by default. The model is a plain Transformer. The baseline is the one most people would reach for. And the standard defence (check a simple baseline) is invariant to the defect by construction, so it cannot fail the broken model.</w:t>
       </w:r>
     </w:p>
     <w:p>
@@ -4298,7 +4298,7 @@
         <w:rPr>
           <w:sz w:val="19"/>
         </w:rPr>
-        <w:t>Everything in this paper — the experiment scripts, the JSON artifacts every number is read from, the figure code, and the source of this document — is at https://github.com/EroKami-727/gmat-pred. A short map of where things are:</w:t>
+        <w:t>Everything in this paper (the experiment scripts, the JSON artifacts every number is read from, the figure code, and the source of this document) is at https://github.com/EroKami-727/gmat-pred. A short map of where things are:</w:t>
       </w:r>
     </w:p>
     <w:p>
@@ -4311,7 +4311,7 @@
         <w:rPr>
           <w:sz w:val="18"/>
         </w:rPr>
-        <w:t>src/ml/ — the experiments. norm_ablation.py produces Table I, baseline_invariance.py Table II, rare_mode_sweep.py Table IV, prune_economics.py Table V. splits.py is the single definition of the train/validation/test partition that all of them share.</w:t>
+        <w:t>src/ml/ holds the experiments. norm_ablation.py produces Table I, baseline_invariance.py Table II, rare_mode_sweep.py Table IV, prune_economics.py Table V. splits.py is the single definition of the train/validation/test partition that all of them share.</w:t>
       </w:r>
     </w:p>
     <w:p>
@@ -4324,7 +4324,7 @@
         <w:rPr>
           <w:sz w:val="18"/>
         </w:rPr>
-        <w:t>src/ml/model.py — the Transformer, and planet_config.py the target list, cadences and the recorded reason the Moon is excluded.</w:t>
+        <w:t>src/ml/model.py is the Transformer, and planet_config.py the target list, cadences and the recorded reason the Moon is excluded.</w:t>
       </w:r>
     </w:p>
     <w:p>
@@ -4337,7 +4337,7 @@
         <w:rPr>
           <w:sz w:val="18"/>
         </w:rPr>
-        <w:t>reports/ — the measured artifacts. Every table and figure here is read from one of these JSON files; multiseed_paper/ holds the per-seed runs behind Table III.</w:t>
+        <w:t>reports/ holds the measured artifacts. Every table and figure here is read from one of these JSON files; multiseed_paper/ holds the per-seed runs behind Table III.</w:t>
       </w:r>
     </w:p>
     <w:p>
@@ -4350,7 +4350,7 @@
         <w:rPr>
           <w:sz w:val="18"/>
         </w:rPr>
-        <w:t>docs/paper/ — this document. content.py holds the prose and builds the tables from the artifacts; figures.py draws every figure from the same artifacts; render_latex.py and build_paper.py render the LaTeX and Word versions. No number in the paper is typed in by hand.</w:t>
+        <w:t>docs/paper/ builds this document. content.py holds the prose and makes the tables from the artifacts; figures.py draws every figure from the same artifacts; render_latex.py and build_paper.py render the LaTeX and Word versions. No number in the paper is typed in by hand.</w:t>
       </w:r>
     </w:p>
     <w:p>
@@ -4363,7 +4363,7 @@
         <w:rPr>
           <w:sz w:val="18"/>
         </w:rPr>
-        <w:t>docs/RESEARCH_LEDGER.md — the full decision history, including two analyses that were invalidated by a positional join and the corrections that replaced them. docs/LIMITATIONS.md states what the results do not support.</w:t>
+        <w:t>docs/RESEARCH_LEDGER.md is the full decision history, including two analyses that were invalidated by a positional join and the corrections that replaced them. docs/LIMITATIONS.md states what the results do not support.</w:t>
       </w:r>
     </w:p>
     <w:p>

</xml_diff>